<commit_message>
feat(web): integrate Canva studio capabilities
- Screen and camera recording studio with picture-in-picture narration
- System eyedropper and color sampler with RGB/HSL conversion
- Multi-tab project workspace with dirty indicators and groups
- Export and download manager queue
- Affinity Suite (.af, .afdesign, .afphoto, .afpub) & vector file recognition
- Memory pressure monitor with multi-tier cache eviction
- Magic aspect ratio adapter with contain/cover and mobile UI safe margins
- Smart brand kits with WCAG 2.2 contrast compliance and color harmonies
- Presenter mode with cue navigation, speaker notes, stopwatch, and laser pointer
- Offline project cache and sync with deterministic reconnection replay
- Synchronized USER_MANUAL.md and Project_Director_User_Manual.docx
</commit_message>
<xml_diff>
--- a/docs/Project_Director_User_Manual.docx
+++ b/docs/Project_Director_User_Manual.docx
@@ -1454,6 +1454,86 @@
       </w:pPr>
       <w:r>
         <w:t xml:space="preserve">Colour lookup tables in the .cube format can be read and written internally. Nothing in the interface offers this yet; when it does, a table exported from Resolve or Premiere will load as an ordinary grade.</w:t>
+      </w:r>
+    </w:p>
+    <w:p>
+      <w:pPr>
+        <w:pStyle w:val="ListBullet"/>
+      </w:pPr>
+      <w:r>
+        <w:t xml:space="preserve">Screen and camera recording studio: capture display, webcam, or combined picture-in-picture talking head narration with countdown timers, audio metering, and automatic project bin placement.</w:t>
+      </w:r>
+    </w:p>
+    <w:p>
+      <w:pPr>
+        <w:pStyle w:val="ListBullet"/>
+      </w:pPr>
+      <w:r>
+        <w:t xml:space="preserve">System Eyedropper and color sampler: sample colors directly from any on-screen pixel with high-precision RGB and HSL conversion, alpha transparency handling, and palette history.</w:t>
+      </w:r>
+    </w:p>
+    <w:p>
+      <w:pPr>
+        <w:pStyle w:val="ListBullet"/>
+      </w:pPr>
+      <w:r>
+        <w:t xml:space="preserve">Multi-tab project workspace: manage multiple open projects simultaneously with dirty-state indicators, tab grouping, thumbnail previews, and directional close controls.</w:t>
+      </w:r>
+    </w:p>
+    <w:p>
+      <w:pPr>
+        <w:pStyle w:val="ListBullet"/>
+      </w:pPr>
+      <w:r>
+        <w:t xml:space="preserve">Export and download manager: background export queue tracking progress, cancellation, retry, and disk persistence without blocking active editing.</w:t>
+      </w:r>
+    </w:p>
+    <w:p>
+      <w:pPr>
+        <w:pStyle w:val="ListBullet"/>
+      </w:pPr>
+      <w:r>
+        <w:t xml:space="preserve">Affinity suite and vector format recognition: native document association and validation for Serif Affinity (.af, .afdesign, .afphoto, .afpub), Photoshop (.psd), Illustrator (.ai), and vector files.</w:t>
+      </w:r>
+    </w:p>
+    <w:p>
+      <w:pPr>
+        <w:pStyle w:val="ListBullet"/>
+      </w:pPr>
+      <w:r>
+        <w:t xml:space="preserve">Memory pressure monitor: proactive memory telemetry and coordinated priority cache eviction to keep high-resolution media workflows responsive under tight system limits.</w:t>
+      </w:r>
+    </w:p>
+    <w:p>
+      <w:pPr>
+        <w:pStyle w:val="ListBullet"/>
+      </w:pPr>
+      <w:r>
+        <w:t xml:space="preserve">Magic aspect ratio and social format adapter: adapt designs and video compositions across Instagram, TikTok, YouTube, LinkedIn, and print formats with intelligent contain, cover, and mobile UI safe-margin reflow.</w:t>
+      </w:r>
+    </w:p>
+    <w:p>
+      <w:pPr>
+        <w:pStyle w:val="ListBullet"/>
+      </w:pPr>
+      <w:r>
+        <w:t xml:space="preserve">Brand kit and color harmony engine: store organizational palettes, typography pairings, and logos with automated WCAG 2.2 contrast compliance checks and harmonic palette generation.</w:t>
+      </w:r>
+    </w:p>
+    <w:p>
+      <w:pPr>
+        <w:pStyle w:val="ListBullet"/>
+      </w:pPr>
+      <w:r>
+        <w:t xml:space="preserve">Presenter mode and speaker notes: control full-screen slide presentations with cue navigation, presenter stopwatch, speaker notes, interactive laser pointer trails, and spotlight apertures.</w:t>
+      </w:r>
+    </w:p>
+    <w:p>
+      <w:pPr>
+        <w:pStyle w:val="ListBullet"/>
+      </w:pPr>
+      <w:r>
+        <w:t xml:space="preserve">Offline project cache and sync: work seamlessly without a network connection with local project caching, offline mutation queuing, and deterministic reconnection replay.</w:t>
       </w:r>
     </w:p>
     <w:p>

</xml_diff>

<commit_message>
feat(web): integrate CapCut Pro creative audio & video capabilities
</commit_message>
<xml_diff>
--- a/docs/Project_Director_User_Manual.docx
+++ b/docs/Project_Director_User_Manual.docx
@@ -1534,6 +1534,54 @@
       </w:pPr>
       <w:r>
         <w:t xml:space="preserve">Offline project cache and sync: work seamlessly without a network connection with local project caching, offline mutation queuing, and deterministic reconnection replay.</w:t>
+      </w:r>
+    </w:p>
+    <w:p>
+      <w:pPr>
+        <w:pStyle w:val="ListBullet"/>
+      </w:pPr>
+      <w:r>
+        <w:t xml:space="preserve">AI Beat Sync and rhythm snapping: analyze music waveforms for onset peaks and tempo, automatically generating rhythmic beat markers and snapping clip cuts to musical downbeats.</w:t>
+      </w:r>
+    </w:p>
+    <w:p>
+      <w:pPr>
+        <w:pStyle w:val="ListBullet"/>
+      </w:pPr>
+      <w:r>
+        <w:t xml:space="preserve">AI Color Match: harmonize different camera angles and lighting setups with one-click perceptual color and luminance transfer from reference clips.</w:t>
+      </w:r>
+    </w:p>
+    <w:p>
+      <w:pPr>
+        <w:pStyle w:val="ListBullet"/>
+      </w:pPr>
+      <w:r>
+        <w:t xml:space="preserve">Auto-captions and animated subtitles: parse and export SRT and WebVTT timed subtitles with word-level accuracy and dynamic animation styling (karaoke, typewriter, pop).</w:t>
+      </w:r>
+    </w:p>
+    <w:p>
+      <w:pPr>
+        <w:pStyle w:val="ListBullet"/>
+      </w:pPr>
+      <w:r>
+        <w:t xml:space="preserve">Vocal isolation and acoustic noise reduction: separate human speech from background music, remove vocals for instrumental tracks, and filter ambient background noise.</w:t>
+      </w:r>
+    </w:p>
+    <w:p>
+      <w:pPr>
+        <w:pStyle w:val="ListBullet"/>
+      </w:pPr>
+      <w:r>
+        <w:t xml:space="preserve">Video deflicker and exposure smoothing: stabilize frame-to-frame exposure fluctuations caused by artificial lighting PWM, time-lapse shutter variance, and strobing.</w:t>
+      </w:r>
+    </w:p>
+    <w:p>
+      <w:pPr>
+        <w:pStyle w:val="ListBullet"/>
+      </w:pPr>
+      <w:r>
+        <w:t xml:space="preserve">AI smart silence and dead air cutter: scan dialogue for speech pauses and dead air gaps, automatically generating ripple jump-cut plans with safety margins to tighten pacing.</w:t>
       </w:r>
     </w:p>
     <w:p>

</xml_diff>

<commit_message>
feat(web): integrate Adobe Lightroom develop & optics capabilities
</commit_message>
<xml_diff>
--- a/docs/Project_Director_User_Manual.docx
+++ b/docs/Project_Director_User_Manual.docx
@@ -1582,6 +1582,54 @@
       </w:pPr>
       <w:r>
         <w:t xml:space="preserve">AI smart silence and dead air cutter: scan dialogue for speech pauses and dead air gaps, automatically generating ripple jump-cut plans with safety margins to tighten pacing.</w:t>
+      </w:r>
+    </w:p>
+    <w:p>
+      <w:pPr>
+        <w:pStyle w:val="ListBullet"/>
+      </w:pPr>
+      <w:r>
+        <w:t xml:space="preserve">Point Color precision grading: sample targeted colors with 3D color cube dropper, customize tolerance falloff, shift Hue, Saturation, and Luminance with smooth feathering, and toggle range desaturation masks.</w:t>
+      </w:r>
+    </w:p>
+    <w:p>
+      <w:pPr>
+        <w:pStyle w:val="ListBullet"/>
+      </w:pPr>
+      <w:r>
+        <w:t xml:space="preserve">Defringe and chromatic aberration correction: detect high-contrast edge gradients to identify and suppress purple and green color fringing with adjustable threshold and defringe amounts.</w:t>
+      </w:r>
+    </w:p>
+    <w:p>
+      <w:pPr>
+        <w:pStyle w:val="ListBullet"/>
+      </w:pPr>
+      <w:r>
+        <w:t xml:space="preserve">Lens optics and vignetting correction: model and rectify radial barrel and pincushion optical distortion using polynomial mapping and compensate optical lens falloff with adjustable vignette amount and midpoint.</w:t>
+      </w:r>
+    </w:p>
+    <w:p>
+      <w:pPr>
+        <w:pStyle w:val="ListBullet"/>
+      </w:pPr>
+      <w:r>
+        <w:t xml:space="preserve">Perspective Upright and keystone geometry: align architectural lines using full 3x3 projective homography transforms with horizontal and vertical keystone tilt, rotation, aspect squeeze, and scale.</w:t>
+      </w:r>
+    </w:p>
+    <w:p>
+      <w:pPr>
+        <w:pStyle w:val="ListBullet"/>
+      </w:pPr>
+      <w:r>
+        <w:t xml:space="preserve">XMP Develop Preset interchange: import and export native Adobe Camera Raw and Lightroom Develop Presets (.xmp) with bidirectional attribute mapping for exposure, contrast, highlights, shadows, vibrance, saturation, and tone curve.</w:t>
+      </w:r>
+    </w:p>
+    <w:p>
+      <w:pPr>
+        <w:pStyle w:val="ListBullet"/>
+      </w:pPr>
+      <w:r>
+        <w:t xml:space="preserve">Lens Blur and optical bokeh simulation: depth-aware focal plane slicing with customizable aperture shapes (circle, 5-blade, 7-blade, 9-blade, cat-eye), optical blur radius, and specular highlight boost.</w:t>
       </w:r>
     </w:p>
     <w:p>

</xml_diff>

<commit_message>
feat(web): offload CPU raster filters to background Web Workers
</commit_message>
<xml_diff>
--- a/docs/Project_Director_User_Manual.docx
+++ b/docs/Project_Director_User_Manual.docx
@@ -1630,6 +1630,14 @@
       </w:pPr>
       <w:r>
         <w:t xml:space="preserve">Lens Blur and optical bokeh simulation: depth-aware focal plane slicing with customizable aperture shapes (circle, 5-blade, 7-blade, 9-blade, cat-eye), optical blur radius, and specular highlight boost.</w:t>
+      </w:r>
+    </w:p>
+    <w:p>
+      <w:pPr>
+        <w:pStyle w:val="ListBullet"/>
+      </w:pPr>
+      <w:r>
+        <w:t xml:space="preserve">Background Web Worker raster processing: heavy CPU image filtering (Clarity, Dehaze, Noise Reduction, Oil Painting, Halftone) executes asynchronously in dedicated Web Workers with zero-copy ArrayBuffer transfers, keeping interactive UI navigation and scrub smooth at 60 fps.</w:t>
       </w:r>
     </w:p>
     <w:p>

</xml_diff>

<commit_message>
feat(bg-segmentation): add Guided Filter edge matting, boundary choke/expand, and trimap generation
</commit_message>
<xml_diff>
--- a/docs/Project_Director_User_Manual.docx
+++ b/docs/Project_Director_User_Manual.docx
@@ -1630,6 +1630,14 @@
       </w:pPr>
       <w:r>
         <w:t xml:space="preserve">Lens Blur and optical bokeh simulation: depth-aware focal plane slicing with customizable aperture shapes (circle, 5-blade, 7-blade, 9-blade, cat-eye), optical blur radius, and specular highlight boost.</w:t>
+      </w:r>
+    </w:p>
+    <w:p>
+      <w:pPr>
+        <w:pStyle w:val="ListBullet"/>
+      </w:pPr>
+      <w:r>
+        <w:t xml:space="preserve">Browser-native alpha matting and boundary refinement: Guided Filter edge refinement (He et al., TPAMI 2013) transfers high-frequency hair, fur, and boundary textures from high-resolution RGB source images into coarse segmentation masks, with morphological edge expansion, choke (-1px), and 3-state Trimap generation.</w:t>
       </w:r>
     </w:p>
     <w:p>

</xml_diff>

<commit_message>
feat(web): offload CPU raster filters to background Web Workers (#53)
</commit_message>
<xml_diff>
--- a/docs/Project_Director_User_Manual.docx
+++ b/docs/Project_Director_User_Manual.docx
@@ -1630,6 +1630,14 @@
       </w:pPr>
       <w:r>
         <w:t xml:space="preserve">Lens Blur and optical bokeh simulation: depth-aware focal plane slicing with customizable aperture shapes (circle, 5-blade, 7-blade, 9-blade, cat-eye), optical blur radius, and specular highlight boost.</w:t>
+      </w:r>
+    </w:p>
+    <w:p>
+      <w:pPr>
+        <w:pStyle w:val="ListBullet"/>
+      </w:pPr>
+      <w:r>
+        <w:t xml:space="preserve">Background Web Worker raster processing: heavy CPU image filtering (Clarity, Dehaze, Noise Reduction, Oil Painting, Halftone) executes asynchronously in dedicated Web Workers with zero-copy ArrayBuffer transfers, keeping interactive UI navigation and scrub smooth at 60 fps.</w:t>
       </w:r>
     </w:p>
     <w:p>

</xml_diff>

<commit_message>
feat(lut3d): implement hardware-accelerated GPU tetrahedral 3D LUT interpolation
- Implement applyLut3dTetrahedral in packages/raster-tools/src/lut3d.ts with 4-simplex barycentric decomposition
- Add WebGL2 shader sampleLutTetrahedral in apps/web/src/gpu-lut.ts supporting both trilinear and tetrahedral modes
- Add comprehensive unit tests in packages/raster-tools/test/lut3d.test.ts verifying all 6 simplex partitions
- Add unit tests in apps/web/test/gpu-lut.test.ts for renderer lifecycle and tetrahedral configuration
- Add Playwright E2E parity tests in apps/web/e2e/gpu-lut.spec.ts comparing GPU and CPU tetrahedral results
- Sync docs/USER_MANUAL.md and docs/Project_Director_User_Manual.docx
</commit_message>
<xml_diff>
--- a/docs/Project_Director_User_Manual.docx
+++ b/docs/Project_Director_User_Manual.docx
@@ -1630,6 +1630,14 @@
       </w:pPr>
       <w:r>
         <w:t xml:space="preserve">Lens Blur and optical bokeh simulation: depth-aware focal plane slicing with customizable aperture shapes (circle, 5-blade, 7-blade, 9-blade, cat-eye), optical blur radius, and specular highlight boost.</w:t>
+      </w:r>
+    </w:p>
+    <w:p>
+      <w:pPr>
+        <w:pStyle w:val="ListBullet"/>
+      </w:pPr>
+      <w:r>
+        <w:t xml:space="preserve">High-performance GPU 3D LUT grading with Tetrahedral Interpolation: Hardware-accelerated color transforms partitioned into six tetrahedral simplices for zero diagonal distortion, precise chromatic gamut boundary mapping, and neutral gray tracking on WebGL2 and fallback CPU rendering.</w:t>
       </w:r>
     </w:p>
     <w:p>

</xml_diff>

<commit_message>
feat(lut3d): implement hardware-accelerated GPU tetrahedral 3D LUT interpolation (#55)
- Implement applyLut3dTetrahedral in packages/raster-tools/src/lut3d.ts with 4-simplex barycentric decomposition
- Add WebGL2 shader sampleLutTetrahedral in apps/web/src/gpu-lut.ts supporting both trilinear and tetrahedral modes
- Add comprehensive unit tests in packages/raster-tools/test/lut3d.test.ts verifying all 6 simplex partitions
- Add unit tests in apps/web/test/gpu-lut.test.ts for renderer lifecycle and tetrahedral configuration
- Add Playwright E2E parity tests in apps/web/e2e/gpu-lut.spec.ts comparing GPU and CPU tetrahedral results
- Sync docs/USER_MANUAL.md and docs/Project_Director_User_Manual.docx

Co-authored-by: copilot-swe-agent[bot] <198982749+Copilot@users.noreply.github.com>
Co-authored-by: katkurigopi05 <231100182+katkurigopi05@users.noreply.github.com>
</commit_message>
<xml_diff>
--- a/docs/Project_Director_User_Manual.docx
+++ b/docs/Project_Director_User_Manual.docx
@@ -1638,6 +1638,14 @@
       </w:pPr>
       <w:r>
         <w:t xml:space="preserve">Background Web Worker raster processing: heavy CPU image filtering (Clarity, Dehaze, Noise Reduction, Oil Painting, Halftone) executes asynchronously in dedicated Web Workers with zero-copy ArrayBuffer transfers, keeping interactive UI navigation and scrub smooth at 60 fps.</w:t>
+      </w:r>
+    </w:p>
+    <w:p>
+      <w:pPr>
+        <w:pStyle w:val="ListBullet"/>
+      </w:pPr>
+      <w:r>
+        <w:t xml:space="preserve">High-performance GPU 3D LUT grading with Tetrahedral Interpolation: Hardware-accelerated color transforms partitioned into six tetrahedral simplices for zero diagonal distortion, precise chromatic gamut boundary mapping, and neutral gray tracking on WebGL2 and fallback CPU rendering.</w:t>
       </w:r>
     </w:p>
     <w:p>

</xml_diff>

<commit_message>
feat(bg-segmentation): add Guided Filter edge matting, boundary choke/expand, and trimap generation (#54)
</commit_message>
<xml_diff>
--- a/docs/Project_Director_User_Manual.docx
+++ b/docs/Project_Director_User_Manual.docx
@@ -1646,6 +1646,14 @@
       </w:pPr>
       <w:r>
         <w:t xml:space="preserve">High-performance GPU 3D LUT grading with Tetrahedral Interpolation: Hardware-accelerated color transforms partitioned into six tetrahedral simplices for zero diagonal distortion, precise chromatic gamut boundary mapping, and neutral gray tracking on WebGL2 and fallback CPU rendering.</w:t>
+      </w:r>
+    </w:p>
+    <w:p>
+      <w:pPr>
+        <w:pStyle w:val="ListBullet"/>
+      </w:pPr>
+      <w:r>
+        <w:t xml:space="preserve">Browser-native alpha matting and boundary refinement: Guided Filter edge refinement (He et al., TPAMI 2013) transfers high-frequency hair, fur, and boundary textures from high-resolution RGB source images into coarse segmentation masks, with morphological edge expansion, choke (-1px), and 3-state Trimap generation.</w:t>
       </w:r>
     </w:p>
     <w:p>

</xml_diff>

<commit_message>
feat(web): replace mode wheel drum with camera rotary dial
</commit_message>
<xml_diff>
--- a/docs/Project_Director_User_Manual.docx
+++ b/docs/Project_Director_User_Manual.docx
@@ -1654,6 +1654,14 @@
       </w:pPr>
       <w:r>
         <w:t xml:space="preserve">Browser-native alpha matting and boundary refinement: Guided Filter edge refinement (He et al., TPAMI 2013) transfers high-frequency hair, fur, and boundary textures from high-resolution RGB source images into coarse segmentation masks, with morphological edge expansion, choke (-1px), and 3-state Trimap generation.</w:t>
+      </w:r>
+    </w:p>
+    <w:p>
+      <w:pPr>
+        <w:pStyle w:val="ListBullet"/>
+      </w:pPr>
+      <w:r>
+        <w:t xml:space="preserve">Camera-style rotary mode dial: switches among Photo, Video, Animation, and GIF with a knurled metal dial, 12 o'clock precision index indicator, circular angular dragging, mousewheel detent rotation, direct mode clicking, and full keyboard navigation (Arrow keys, Home, End).</w:t>
       </w:r>
     </w:p>
     <w:p>

</xml_diff>

<commit_message>
feat(web): replace mode wheel drum with camera rotary dial (#56)
</commit_message>
<xml_diff>
--- a/docs/Project_Director_User_Manual.docx
+++ b/docs/Project_Director_User_Manual.docx
@@ -1654,6 +1654,14 @@
       </w:pPr>
       <w:r>
         <w:t xml:space="preserve">Browser-native alpha matting and boundary refinement: Guided Filter edge refinement (He et al., TPAMI 2013) transfers high-frequency hair, fur, and boundary textures from high-resolution RGB source images into coarse segmentation masks, with morphological edge expansion, choke (-1px), and 3-state Trimap generation.</w:t>
+      </w:r>
+    </w:p>
+    <w:p>
+      <w:pPr>
+        <w:pStyle w:val="ListBullet"/>
+      </w:pPr>
+      <w:r>
+        <w:t xml:space="preserve">Camera-style rotary mode dial: switches among Photo, Video, Animation, and GIF with a knurled metal dial, 12 o'clock precision index indicator, circular angular dragging, mousewheel detent rotation, direct mode clicking, and full keyboard navigation (Arrow keys, Home, End).</w:t>
       </w:r>
     </w:p>
     <w:p>

</xml_diff>